<commit_message>
Liberación Exprés: quitar teléfonos y placa
</commit_message>
<xml_diff>
--- a/siniestros/plantillas/liberacion.docx
+++ b/siniestros/plantillas/liberacion.docx
@@ -387,7 +387,8 @@
         </w:tc>
         <w:tc>
           <w:tcPr>
-            <w:tcW w:w="0" w:type="auto"/>
+            <w:tcW w:w="2356" w:type="dxa"/>
+            <w:gridSpan w:val="3"/>
             <w:tcBorders>
               <w:top w:val="single" w:sz="6" w:space="0" w:color="000000"/>
               <w:left w:val="single" w:sz="6" w:space="0" w:color="000000"/>
@@ -415,97 +416,6 @@
                 <w:szCs w:val="20"/>
               </w:rPr>
               <w:t>{{ economico }}</w:t>
-            </w:r>
-            <w:r>
-              <w:rPr>
-                <w:sz w:val="20"/>
-                <w:szCs w:val="20"/>
-              </w:rPr>
-            </w:r>
-            <w:r>
-              <w:rPr>
-                <w:sz w:val="20"/>
-                <w:szCs w:val="20"/>
-              </w:rPr>
-            </w:r>
-            <w:r>
-              <w:rPr>
-                <w:noProof/>
-                <w:sz w:val="20"/>
-                <w:szCs w:val="20"/>
-              </w:rPr>
-            </w:r>
-            <w:r>
-              <w:rPr>
-                <w:sz w:val="20"/>
-                <w:szCs w:val="20"/>
-              </w:rPr>
-            </w:r>
-          </w:p>
-        </w:tc>
-        <w:tc>
-          <w:tcPr>
-            <w:tcW w:w="0" w:type="auto"/>
-            <w:tcBorders>
-              <w:top w:val="single" w:sz="6" w:space="0" w:color="000000"/>
-              <w:left w:val="single" w:sz="6" w:space="0" w:color="000000"/>
-              <w:bottom w:val="single" w:sz="6" w:space="0" w:color="000000"/>
-              <w:right w:val="single" w:sz="6" w:space="0" w:color="000000"/>
-            </w:tcBorders>
-            <w:tcMar>
-              <w:top w:w="0" w:type="dxa"/>
-              <w:left w:w="80" w:type="dxa"/>
-              <w:bottom w:w="0" w:type="dxa"/>
-              <w:right w:w="80" w:type="dxa"/>
-            </w:tcMar>
-            <w:hideMark/>
-          </w:tcPr>
-          <w:p>
-            <w:pPr>
-              <w:rPr>
-                <w:sz w:val="20"/>
-                <w:szCs w:val="20"/>
-              </w:rPr>
-            </w:pPr>
-            <w:r>
-              <w:rPr>
-                <w:sz w:val="20"/>
-                <w:szCs w:val="20"/>
-              </w:rPr>
-              <w:t>#placa</w:t>
-            </w:r>
-          </w:p>
-        </w:tc>
-        <w:tc>
-          <w:tcPr>
-            <w:tcW w:w="0" w:type="auto"/>
-            <w:tcBorders>
-              <w:top w:val="single" w:sz="6" w:space="0" w:color="000000"/>
-              <w:left w:val="single" w:sz="6" w:space="0" w:color="000000"/>
-              <w:bottom w:val="single" w:sz="6" w:space="0" w:color="000000"/>
-              <w:right w:val="single" w:sz="6" w:space="0" w:color="000000"/>
-            </w:tcBorders>
-            <w:tcMar>
-              <w:top w:w="0" w:type="dxa"/>
-              <w:left w:w="80" w:type="dxa"/>
-              <w:bottom w:w="0" w:type="dxa"/>
-              <w:right w:w="80" w:type="dxa"/>
-            </w:tcMar>
-            <w:hideMark/>
-          </w:tcPr>
-          <w:p>
-            <w:pPr>
-              <w:rPr>
-                <w:sz w:val="20"/>
-                <w:szCs w:val="20"/>
-              </w:rPr>
-            </w:pPr>
-            <w:r>
-              <w:rPr>
-                <w:sz w:val="20"/>
-                <w:szCs w:val="20"/>
-              </w:rPr>
-              <w:t>{{ placa }}</w:t>
             </w:r>
             <w:r>
               <w:rPr>
@@ -729,8 +639,8 @@
         </w:tc>
         <w:tc>
           <w:tcPr>
-            <w:tcW w:w="0" w:type="auto"/>
-            <w:gridSpan w:val="2"/>
+            <w:tcW w:w="5458" w:type="dxa"/>
+            <w:gridSpan w:val="5"/>
             <w:tcBorders>
               <w:top w:val="single" w:sz="6" w:space="0" w:color="000000"/>
               <w:left w:val="single" w:sz="6" w:space="0" w:color="000000"/>
@@ -758,98 +668,6 @@
                 <w:szCs w:val="20"/>
               </w:rPr>
               <w:t>{{ no_empleado }}</w:t>
-            </w:r>
-            <w:r>
-              <w:rPr>
-                <w:sz w:val="20"/>
-                <w:szCs w:val="20"/>
-              </w:rPr>
-            </w:r>
-            <w:r>
-              <w:rPr>
-                <w:sz w:val="20"/>
-                <w:szCs w:val="20"/>
-              </w:rPr>
-            </w:r>
-            <w:r>
-              <w:rPr>
-                <w:noProof/>
-                <w:sz w:val="20"/>
-                <w:szCs w:val="20"/>
-              </w:rPr>
-            </w:r>
-            <w:r>
-              <w:rPr>
-                <w:sz w:val="20"/>
-                <w:szCs w:val="20"/>
-              </w:rPr>
-            </w:r>
-          </w:p>
-        </w:tc>
-        <w:tc>
-          <w:tcPr>
-            <w:tcW w:w="0" w:type="auto"/>
-            <w:tcBorders>
-              <w:top w:val="single" w:sz="6" w:space="0" w:color="000000"/>
-              <w:left w:val="single" w:sz="6" w:space="0" w:color="000000"/>
-              <w:bottom w:val="single" w:sz="6" w:space="0" w:color="000000"/>
-              <w:right w:val="single" w:sz="6" w:space="0" w:color="000000"/>
-            </w:tcBorders>
-            <w:tcMar>
-              <w:top w:w="0" w:type="dxa"/>
-              <w:left w:w="80" w:type="dxa"/>
-              <w:bottom w:w="0" w:type="dxa"/>
-              <w:right w:w="80" w:type="dxa"/>
-            </w:tcMar>
-            <w:hideMark/>
-          </w:tcPr>
-          <w:p>
-            <w:pPr>
-              <w:rPr>
-                <w:sz w:val="20"/>
-                <w:szCs w:val="20"/>
-              </w:rPr>
-            </w:pPr>
-            <w:r>
-              <w:rPr>
-                <w:sz w:val="20"/>
-                <w:szCs w:val="20"/>
-              </w:rPr>
-              <w:t># Tel</w:t>
-            </w:r>
-          </w:p>
-        </w:tc>
-        <w:tc>
-          <w:tcPr>
-            <w:tcW w:w="3102" w:type="dxa"/>
-            <w:gridSpan w:val="2"/>
-            <w:tcBorders>
-              <w:top w:val="single" w:sz="6" w:space="0" w:color="000000"/>
-              <w:left w:val="single" w:sz="6" w:space="0" w:color="000000"/>
-              <w:bottom w:val="single" w:sz="6" w:space="0" w:color="000000"/>
-              <w:right w:val="single" w:sz="6" w:space="0" w:color="000000"/>
-            </w:tcBorders>
-            <w:tcMar>
-              <w:top w:w="0" w:type="dxa"/>
-              <w:left w:w="80" w:type="dxa"/>
-              <w:bottom w:w="0" w:type="dxa"/>
-              <w:right w:w="80" w:type="dxa"/>
-            </w:tcMar>
-            <w:hideMark/>
-          </w:tcPr>
-          <w:p>
-            <w:pPr>
-              <w:rPr>
-                <w:sz w:val="20"/>
-                <w:szCs w:val="20"/>
-              </w:rPr>
-            </w:pPr>
-            <w:r>
-              <w:rPr>
-                <w:sz w:val="20"/>
-                <w:szCs w:val="20"/>
-              </w:rPr>
-              <w:t>{{ telefono }}</w:t>
             </w:r>
             <w:r>
               <w:rPr>

</xml_diff>

<commit_message>
Liberación exprés: generalidades completas (daños, alcohol, seguros)
</commit_message>
<xml_diff>
--- a/siniestros/plantillas/liberacion.docx
+++ b/siniestros/plantillas/liberacion.docx
@@ -822,6 +822,53 @@
                 <w:sz w:val="20"/>
                 <w:szCs w:val="20"/>
               </w:rPr>
+            </w:r>
+          </w:p>
+          <w:p>
+            <w:pPr>
+              <w:rPr>
+                <w:sz w:val="20"/>
+                <w:szCs w:val="20"/>
+              </w:rPr>
+            </w:pPr>
+            <w:r>
+              <w:rPr>
+                <w:sz w:val="20"/>
+                <w:szCs w:val="20"/>
+              </w:rPr>
+              <w:t>{%p if generalidades %}</w:t>
+            </w:r>
+          </w:p>
+          <w:p>
+            <w:pPr>
+              <w:spacing w:before="120"/>
+              <w:rPr>
+                <w:sz w:val="20"/>
+                <w:szCs w:val="20"/>
+              </w:rPr>
+            </w:pPr>
+            <w:r>
+              <w:rPr>
+                <w:i w:val="0"/>
+                <w:sz w:val="18"/>
+                <w:szCs w:val="20"/>
+              </w:rPr>
+              <w:t>{{ generalidades }}</w:t>
+            </w:r>
+          </w:p>
+          <w:p>
+            <w:pPr>
+              <w:rPr>
+                <w:sz w:val="20"/>
+                <w:szCs w:val="20"/>
+              </w:rPr>
+            </w:pPr>
+            <w:r>
+              <w:rPr>
+                <w:sz w:val="20"/>
+                <w:szCs w:val="20"/>
+              </w:rPr>
+              <w:t>{%p endif %}</w:t>
             </w:r>
           </w:p>
           <w:p>

</xml_diff>

<commit_message>
Liberación exprés: quitar ubicación y descripción
</commit_message>
<xml_diff>
--- a/siniestros/plantillas/liberacion.docx
+++ b/siniestros/plantillas/liberacion.docx
@@ -102,7 +102,8 @@
         </w:tc>
         <w:tc>
           <w:tcPr>
-            <w:tcW w:w="2427" w:type="dxa"/>
+            <w:tcW w:w="8949" w:type="dxa"/>
+            <w:gridSpan w:val="7"/>
             <w:tcBorders>
               <w:top w:val="single" w:sz="6" w:space="0" w:color="000000"/>
               <w:left w:val="single" w:sz="6" w:space="0" w:color="000000"/>
@@ -145,98 +146,6 @@
             </w:r>
             <w:r>
               <w:rPr>
-                <w:sz w:val="20"/>
-                <w:szCs w:val="20"/>
-              </w:rPr>
-            </w:r>
-            <w:r>
-              <w:rPr>
-                <w:sz w:val="20"/>
-                <w:szCs w:val="20"/>
-              </w:rPr>
-            </w:r>
-          </w:p>
-        </w:tc>
-        <w:tc>
-          <w:tcPr>
-            <w:tcW w:w="1065" w:type="dxa"/>
-            <w:tcBorders>
-              <w:top w:val="single" w:sz="6" w:space="0" w:color="000000"/>
-              <w:left w:val="single" w:sz="6" w:space="0" w:color="000000"/>
-              <w:bottom w:val="single" w:sz="6" w:space="0" w:color="000000"/>
-              <w:right w:val="single" w:sz="6" w:space="0" w:color="000000"/>
-            </w:tcBorders>
-            <w:tcMar>
-              <w:top w:w="0" w:type="dxa"/>
-              <w:left w:w="80" w:type="dxa"/>
-              <w:bottom w:w="0" w:type="dxa"/>
-              <w:right w:w="80" w:type="dxa"/>
-            </w:tcMar>
-            <w:hideMark/>
-          </w:tcPr>
-          <w:p>
-            <w:pPr>
-              <w:rPr>
-                <w:sz w:val="20"/>
-                <w:szCs w:val="20"/>
-              </w:rPr>
-            </w:pPr>
-            <w:r>
-              <w:rPr>
-                <w:sz w:val="20"/>
-                <w:szCs w:val="20"/>
-              </w:rPr>
-              <w:t>ubicación</w:t>
-            </w:r>
-          </w:p>
-        </w:tc>
-        <w:tc>
-          <w:tcPr>
-            <w:tcW w:w="5457" w:type="dxa"/>
-            <w:gridSpan w:val="5"/>
-            <w:tcBorders>
-              <w:top w:val="single" w:sz="6" w:space="0" w:color="000000"/>
-              <w:left w:val="single" w:sz="6" w:space="0" w:color="000000"/>
-              <w:bottom w:val="single" w:sz="6" w:space="0" w:color="000000"/>
-              <w:right w:val="single" w:sz="6" w:space="0" w:color="000000"/>
-            </w:tcBorders>
-            <w:tcMar>
-              <w:top w:w="0" w:type="dxa"/>
-              <w:left w:w="80" w:type="dxa"/>
-              <w:bottom w:w="0" w:type="dxa"/>
-              <w:right w:w="80" w:type="dxa"/>
-            </w:tcMar>
-            <w:hideMark/>
-          </w:tcPr>
-          <w:p>
-            <w:pPr>
-              <w:rPr>
-                <w:sz w:val="20"/>
-                <w:szCs w:val="20"/>
-              </w:rPr>
-            </w:pPr>
-            <w:r>
-              <w:rPr>
-                <w:sz w:val="20"/>
-                <w:szCs w:val="20"/>
-              </w:rPr>
-              <w:t>{{ ubicacion }}</w:t>
-            </w:r>
-            <w:r>
-              <w:rPr>
-                <w:sz w:val="20"/>
-                <w:szCs w:val="20"/>
-              </w:rPr>
-            </w:r>
-            <w:r>
-              <w:rPr>
-                <w:sz w:val="20"/>
-                <w:szCs w:val="20"/>
-              </w:rPr>
-            </w:r>
-            <w:r>
-              <w:rPr>
-                <w:noProof/>
                 <w:sz w:val="20"/>
                 <w:szCs w:val="20"/>
               </w:rPr>
@@ -790,7 +699,6 @@
                 <w:sz w:val="20"/>
                 <w:szCs w:val="20"/>
               </w:rPr>
-              <w:t>{{ descripcion }}</w:t>
             </w:r>
             <w:r>
               <w:rPr>

</xml_diff>

<commit_message>
Firma predeterminada del perito
</commit_message>
<xml_diff>
--- a/siniestros/plantillas/liberacion.docx
+++ b/siniestros/plantillas/liberacion.docx
@@ -1241,17 +1241,18 @@
           </w:p>
           <w:p>
             <w:pPr>
-              <w:rPr>
-                <w:sz w:val="20"/>
-                <w:szCs w:val="20"/>
-              </w:rPr>
-            </w:pPr>
-            <w:r>
-              <w:rPr>
-                <w:sz w:val="20"/>
-                <w:szCs w:val="20"/>
-              </w:rPr>
-              <w:t> </w:t>
+              <w:jc w:val="center"/>
+              <w:rPr>
+                <w:sz w:val="20"/>
+                <w:szCs w:val="20"/>
+              </w:rPr>
+            </w:pPr>
+            <w:r>
+              <w:rPr>
+                <w:sz w:val="20"/>
+                <w:szCs w:val="20"/>
+              </w:rPr>
+              <w:t>{{ firma_perito }}</w:t>
             </w:r>
           </w:p>
           <w:p>

</xml_diff>